<commit_message>
MOO-191: point the Director's disposition at the commission, MOO-208, and correct the live-issue list
Co-Authored-By: Claude Opus 5 <noreply@anthropic.com>
</commit_message>
<xml_diff>
--- a/moo191-director/MOO-191 - Policy Director disposition of MOO-195.docx
+++ b/moo191-director/MOO-191 - Policy Director disposition of MOO-195.docx
@@ -2067,7 +2067,18 @@
         <w:t>Re-resolve everything on the base as it stands at the moment of application.</w:t>
       </w:r>
       <w:r>
-        <w:t xml:space="preserve"> The base moved three times under the last cut and MOO-197, MOO-199 and MOO-200 are live. An anchor counted in this document is not an anchor.</w:t>
+        <w:t xml:space="preserve"> The base moved three times under the last cut and MOO-197 and MOO-97 are live on the same text. An anchor counted in this document is not an anchor.</w:t>
+      </w:r>
+    </w:p>
+    <w:p>
+      <w:pPr>
+        <w:jc w:val="left"/>
+      </w:pPr>
+      <w:r>
+        <w:rPr>
+          <w:b/>
+        </w:rPr>
+        <w:t>Commissioned at [MOO-208](/MOO/issues/MOO-208).</w:t>
       </w:r>
     </w:p>
     <w:p>

</xml_diff>